<commit_message>
Regenerate JCMDS submission package with reviewer-perspective fixes
Co-Authored-By: Tatsuki Onishi <bougtoir@gmail.com>
</commit_message>
<xml_diff>
--- a/results/manuscript/jcmds_submission/IONE_jcmds_v1.docx
+++ b/results/manuscript/jcmds_submission/IONE_jcmds_v1.docx
@@ -964,24 +964,7 @@
         </m:sSub>
       </m:oMath>
       <w:r>
-        <w:t xml:space="preserve">) and include </w:t>
-      </w:r>
-      <m:oMath>
-        <m:sSup>
-          <m:e>
-            <m:r>
-              <m:t xml:space="preserve">η</m:t>
-            </m:r>
-          </m:e>
-          <m:sup>
-            <m:r>
-              <m:t xml:space="preserve">2</m:t>
-            </m:r>
-          </m:sup>
-        </m:sSup>
-      </m:oMath>
-      <w:r>
-        <w:t xml:space="preserve">, the ratio of between-stratum CATE variance to overall CATE variance, as an alternative scale-free summary.</w:t>
+        <w:t xml:space="preserve">) and include eta-squared, the ratio of between-stratum CATE variance to overall CATE variance, as an alternative scale-free summary.</w:t>
       </w:r>
     </w:p>
     <w:p>
@@ -3686,7 +3669,7 @@
     </w:p>
     <w:p>
       <w:r>
-        <w:t>Figure 4 and Supplementary Table S2 report n = 500, 2000 and 10 000 (K=5). Crude bias declined with n. The residual method's absolute random-effects ATE bias plateaued near 0.008–0.009 across the three sample sizes (0.00824 at n=500, 0.00852 at n=2000 and 0.00864 at n=10 000), so its relative reduction fell as the crude marginal estimate became more precise. Propensity-score, prognostic-score and clustering-based methods achieved larger relative reductions at n=10 000 (range 0.533–0.669), showing that performance depends on the method as well as sample size. This pattern indicates that stratification can reduce the component of aggregation bias that is predictable from measured covariates, but it cannot fully adjust for unmodelled hidden effect modification.</w:t>
+        <w:t>Figure 4 and Supplementary Table S2 report n = 500, 2000 and 10 000 (K=5). These estimates are from a separate 30-replication sensitivity batch, so point estimates are noisier than the primary scenario. Crude bias declined with n. The residual method's absolute random-effects ATE bias plateaued near 0.008–0.009 across the three sample sizes (0.00824 at n=500, 0.00852 at n=2000 and 0.00864 at n=10 000); the slight differences between this n=2000 value and the 50-replication primary value in Table 1 (0.00816) reflect Monte Carlo variation. Its relative reduction therefore fell as the crude marginal estimate became more precise. Propensity-score, prognostic-score and clustering-based methods achieved larger relative reductions at n=10 000 (range 0.533–0.669), showing that performance depends on the method as well as sample size. This pattern indicates that stratification can reduce the component of aggregation bias that is predictable from measured covariates, but it cannot fully adjust for unmodelled hidden effect modification.</w:t>
       </w:r>
     </w:p>
     <w:p>
@@ -4391,7 +4374,7 @@
         <w:drawing>
           <wp:inline xmlns:a="http://schemas.openxmlformats.org/drawingml/2006/main" xmlns:pic="http://schemas.openxmlformats.org/drawingml/2006/picture">
             <wp:extent cx="5303520" cy="3314700"/>
-            <wp:docPr id="5" name="Picture 5" descr="Figure 5. Non-linear Z-&gt;X robustness: random-effects ATE bias reduction (n=2000, K=5)."/>
+            <wp:docPr id="5" name="Picture 5" descr="Figure 5. Non-linear Z-to-X robustness: random-effects ATE bias reduction (n=2000, K=5)."/>
             <wp:cNvGraphicFramePr>
               <a:graphicFrameLocks noChangeAspect="1"/>
             </wp:cNvGraphicFramePr>
@@ -4431,7 +4414,7 @@
         <w:rPr>
           <w:b/>
         </w:rPr>
-        <w:t>Figure 5. Non-linear Z-&gt;X robustness: random-effects ATE bias reduction (n=2000, K=5).</w:t>
+        <w:t>Figure 5. Non-linear Z-to-X robustness: random-effects ATE bias reduction (n=2000, K=5).</w:t>
       </w:r>
     </w:p>
     <w:p>
@@ -5313,24 +5296,7 @@
     </w:p>
     <w:p>
       <w:r>
-        <w:t xml:space="preserve">Figure 7 shows CATE variance explained (</w:t>
-      </w:r>
-      <m:oMath>
-        <m:sSup>
-          <m:e>
-            <m:r>
-              <m:t xml:space="preserve">η</m:t>
-            </m:r>
-          </m:e>
-          <m:sup>
-            <m:r>
-              <m:t xml:space="preserve">2</m:t>
-            </m:r>
-          </m:sup>
-        </m:sSup>
-      </m:oMath>
-      <w:r>
-        <w:t xml:space="preserve">, represented by </w:t>
+        <w:t xml:space="preserve">Figure 7 shows CATE variance explained (eta-squared, represented by </w:t>
       </w:r>
       <m:oMath>
         <m:sSub>
@@ -5364,24 +5330,7 @@
         </m:sSub>
       </m:oMath>
       <w:r>
-        <w:t xml:space="preserve">) for each method. Methods that produced stratum-specific effects close to the true CATE quantiles achieved higher </w:t>
-      </w:r>
-      <m:oMath>
-        <m:sSup>
-          <m:e>
-            <m:r>
-              <m:t xml:space="preserve">η</m:t>
-            </m:r>
-          </m:e>
-          <m:sup>
-            <m:r>
-              <m:t xml:space="preserve">2</m:t>
-            </m:r>
-          </m:sup>
-        </m:sSup>
-      </m:oMath>
-      <w:r>
-        <w:t xml:space="preserve">, but no data-driven method reached the Oracle level. The gap between </w:t>
+        <w:t xml:space="preserve">) for each method. Methods that produced stratum-specific effects close to the true CATE quantiles achieved higher eta-squared, but no data-driven method reached the Oracle level. The gap between </w:t>
       </w:r>
       <m:oMath>
         <m:sSub>
@@ -5427,7 +5376,7 @@
         <w:drawing>
           <wp:inline xmlns:a="http://schemas.openxmlformats.org/drawingml/2006/main" xmlns:pic="http://schemas.openxmlformats.org/drawingml/2006/picture">
             <wp:extent cx="5303520" cy="3314700"/>
-            <wp:docPr id="7" name="Picture 7" descr="Figure 7. CATE variance explained (eta^2 = W_true) and estimated W_est by method in the primary scenario (n=2000, K=5)."/>
+            <wp:docPr id="7" name="Picture 7" descr="Figure 7. CATE variance explained (eta-squared = W_true) and estimated W_est by method in the primary scenario (n=2000, K=5)."/>
             <wp:cNvGraphicFramePr>
               <a:graphicFrameLocks noChangeAspect="1"/>
             </wp:cNvGraphicFramePr>
@@ -5467,27 +5416,7 @@
         <w:rPr>
           <w:b/>
         </w:rPr>
-        <w:t xml:space="preserve">Figure 7. CATE variance explained (</w:t>
-      </w:r>
-      <m:oMath>
-        <m:sSup>
-          <m:e>
-            <m:r>
-              <m:t xml:space="preserve">η</m:t>
-            </m:r>
-          </m:e>
-          <m:sup>
-            <m:r>
-              <m:t xml:space="preserve">2</m:t>
-            </m:r>
-          </m:sup>
-        </m:sSup>
-      </m:oMath>
-      <w:r>
-        <w:rPr>
-          <w:b/>
-        </w:rPr>
-        <w:t xml:space="preserve"> = </w:t>
+        <w:t xml:space="preserve">Figure 7. CATE variance explained (eta-squared = </w:t>
       </w:r>
       <m:oMath>
         <m:sSub>
@@ -5727,7 +5656,7 @@
           </w:tcPr>
           <w:p>
             <w:r>
-              <w:t>Prognostic-score or predicted-probability stratification (1A)</w:t>
+              <w:t>Prognostic-score stratification (1A predicted-probability as a close alternative)</w:t>
             </w:r>
           </w:p>
         </w:tc>
@@ -5737,7 +5666,7 @@
           </w:tcPr>
           <w:p>
             <w:r>
-              <w:t>Largest relative reductions and smallest absolute RE biases at n = 10 000 once finite-sample error was small</w:t>
+              <w:t>Smallest absolute RE bias and largest relative reduction at n = 10 000; predicted-probability stratification was second and comparable</w:t>
             </w:r>
           </w:p>
         </w:tc>
@@ -5747,7 +5676,7 @@
           </w:tcPr>
           <w:p>
             <w:r>
-              <w:t>The residual method remained at its absolute bias floor, so relative reduction alone is not enough to rank methods; choose the metric that matches the clinical question</w:t>
+              <w:t>Relative ranking depends on the sample size and chosen metric; choose the method whose constraints match the clinical question</w:t>
             </w:r>
           </w:p>
         </w:tc>
@@ -6198,7 +6127,7 @@
     </w:p>
     <w:p>
       <w:r>
-        <w:t>At n = 10 000 the residual method still showed a non-negligible random-effects ATE bias (0.00864; relative reduction 0.348), similar to the absolute floor observed at n=500 (0.00824) and n=2000 (0.00852). This floor is consistent with the ARI ceiling: once finite-sample error is removed, remaining bias reflects the structural mismatch between the discovered strata and the true CATE surface. The true-CATE-quantile oracle provides an upper bound on what perfect sorting could achieve; the gap between the oracle and the leading data-driven method quantifies the cost of not observing the true effect modifier.</w:t>
+        <w:t>At n = 10 000 the residual method still showed a non-negligible random-effects ATE bias (0.00864; relative reduction 0.348), similar to the absolute floor observed at n=500 (0.00824) and n=2000 (0.00852). This floor is consistent with the bounded sorting accuracy reflected in the modest ARI values: once finite-sample error is removed, remaining bias reflects the structural mismatch between the discovered strata and the true CATE surface. The true-CATE-quantile oracle provides an upper bound on what perfect sorting could achieve; the gap between the oracle and the leading data-driven method quantifies the cost of not observing the true effect modifier.</w:t>
       </w:r>
     </w:p>
     <w:p>
@@ -6206,12 +6135,77 @@
         <w:pStyle w:val="Heading2"/>
       </w:pPr>
       <w:r>
-        <w:t>Relevance to JCMDS readers</w:t>
+        <w:t>Strengths and limitations</w:t>
       </w:r>
     </w:p>
     <w:p>
-      <w:r>
-        <w:t xml:space="preserve">IONE sits between computational stratification diagnostics and model-based effect modification for individual participant data meta-analysis. C1 applies the </w:t>
+      <w:r/>
+      <w:r>
+        <w:rPr>
+          <w:b/>
+        </w:rPr>
+        <w:t>Strengths.</w:t>
+      </w:r>
+      <w:r>
+        <w:t xml:space="preserve"> The study followed ADEMP </w:t>
+      </w:r>
+      <w:r>
+        <w:rPr>
+          <w:vertAlign w:val="superscript"/>
+        </w:rPr>
+        <w:t>16</w:t>
+      </w:r>
+      <w:r>
+        <w:t>, reported the data-generating mechanism and estimands transparently, and generated all numerical results from version-controlled repository scripts.</w:t>
+      </w:r>
+    </w:p>
+    <w:p>
+      <w:pPr>
+        <w:spacing w:before="240"/>
+      </w:pPr>
+      <w:r/>
+      <w:r>
+        <w:rPr>
+          <w:b/>
+        </w:rPr>
+        <w:t>Limitations.</w:t>
+      </w:r>
+      <w:r>
+        <w:t xml:space="preserve"> The primary scenario used n=2000 and a moderate Z-to-X trace; sensitivity analyses examined K = 3, 5, 10, n = 500 to 10 000, Z-to-Y and Z-to-X scales, and a non-linear mapping, but performance may vary with stronger or weaker signals or fewer studies. The true-Z partition is a constructed reference, so ARI should not be over-interpreted as clinical validity. </w:t>
+      </w:r>
+      <m:oMath>
+        <m:sSub>
+          <m:e>
+            <m:r>
+              <m:t xml:space="preserve">W</m:t>
+            </m:r>
+          </m:e>
+          <m:sub>
+            <m:r>
+              <m:t xml:space="preserve">est</m:t>
+            </m:r>
+          </m:sub>
+        </m:sSub>
+      </m:oMath>
+      <w:r>
+        <w:t xml:space="preserve"> depends on a correctly specified outcome model with interactions; a main-effects-only model can be highly misleading (Supplementary Table S6). DerSimonian-Laird strata are not independent estimates, so the reported </w:t>
+      </w:r>
+      <m:oMath>
+        <m:sSup>
+          <m:e>
+            <m:r>
+              <m:t xml:space="preserve">τ</m:t>
+            </m:r>
+          </m:e>
+          <m:sup>
+            <m:r>
+              <m:t xml:space="preserve">2</m:t>
+            </m:r>
+          </m:sup>
+        </m:sSup>
+      </m:oMath>
+      <w:r>
+        <w:t xml:space="preserve"> and </w:t>
       </w:r>
       <m:oMath>
         <m:sSup>
@@ -6228,7 +6222,228 @@
         </m:sSup>
       </m:oMath>
       <w:r>
-        <w:t xml:space="preserve"> statistic to discovered strata, and W measures how much CATE variance a partition explains. Both are descriptive sensitivity indices, not inferential tests. The empirical null distribution (Supplementary Table S5) calibrates the diagnostics under no true effect modification, and the misspecification sensitivity (Supplementary Table S6) checks whether </w:t>
+        <w:t xml:space="preserve"> describe between-stratum heterogeneity, not conventional between-study heterogeneity. C1 is computed from log odds ratios while ATE bias is on the risk-difference scale, so it is an indirect diagnostic. Null thresholds (Supplementary Table S5) are method-specific and conditional on the primary DGM. Semi-synthetic examples are pseudo-IPD reconstructions and serve as illustrations, not real-IPD validation.</w:t>
+      </w:r>
+    </w:p>
+    <w:p>
+      <w:pPr>
+        <w:pStyle w:val="Heading1"/>
+      </w:pPr>
+      <w:r>
+        <w:t>5. Conclusions</w:t>
+      </w:r>
+    </w:p>
+    <w:p>
+      <w:r>
+        <w:t>IONE (Incoherence-Oriented Neutralisation and Extraction) is a descriptive sensitivity framework for hidden effect modification in IPD meta-analysis. Monte Carlo simulation and semi-synthetic examples show that the C1 and W diagnostics can flag incoherence, but they do not reliably separate the alternative data-generating mechanism from an empirical null in the primary scenario. When hidden variables leave strong traces in measured covariates, stratification can partially reduce ATE bias, but separating the data into the true hidden subgroups remains difficult. Conventional meta-analytic models and covariate adjustment should remain the primary analysis; C1 and W should be reported alongside them as sensitivity checks. Two practical recommendations are: (1) use C1 and W only as descriptive flags, not as inferential tests for hidden effect modification, and (2) pre-specify potential effect modifiers and reserve data-driven stratification for exploratory sensitivity analyses, not for decision-making.</w:t>
+      </w:r>
+    </w:p>
+    <w:p>
+      <w:r>
+        <w:br w:type="page"/>
+      </w:r>
+    </w:p>
+    <w:p>
+      <w:pPr>
+        <w:pStyle w:val="Heading1"/>
+      </w:pPr>
+      <w:r>
+        <w:t>Declarations</w:t>
+      </w:r>
+    </w:p>
+    <w:p>
+      <w:pPr>
+        <w:pStyle w:val="Heading2"/>
+      </w:pPr>
+      <w:r>
+        <w:t>Ethics approval and consent to participate</w:t>
+      </w:r>
+    </w:p>
+    <w:p>
+      <w:r>
+        <w:t>Not applicable. This study used simulated data and publicly available aggregate statistics only.</w:t>
+      </w:r>
+    </w:p>
+    <w:p>
+      <w:pPr>
+        <w:pStyle w:val="Heading2"/>
+      </w:pPr>
+      <w:r>
+        <w:t>Consent for publication</w:t>
+      </w:r>
+    </w:p>
+    <w:p>
+      <w:r>
+        <w:t>Not applicable.</w:t>
+      </w:r>
+    </w:p>
+    <w:p>
+      <w:pPr>
+        <w:pStyle w:val="Heading2"/>
+      </w:pPr>
+      <w:r>
+        <w:t>Availability of data and materials</w:t>
+      </w:r>
+    </w:p>
+    <w:p>
+      <w:r>
+        <w:t xml:space="preserve">All simulation code, analysis scripts, semi-synthetic example data, and the manuscript generator are publicly available at https://github.com/bougtoir/ione-stratification-framework. The repository contains a </w:t>
+      </w:r>
+      <w:r>
+        <w:rPr>
+          <w:rFonts w:ascii="Courier New" w:hAnsi="Courier New"/>
+        </w:rPr>
+        <w:t>requirements.txt</w:t>
+      </w:r>
+      <w:r>
+        <w:t xml:space="preserve"> file and a </w:t>
+      </w:r>
+      <w:r>
+        <w:rPr>
+          <w:rFonts w:ascii="Courier New" w:hAnsi="Courier New"/>
+        </w:rPr>
+        <w:t>requirements-lock.txt</w:t>
+      </w:r>
+      <w:r>
+        <w:t xml:space="preserve"> file with exact package versions, fixed random seeds for every scenario, and </w:t>
+      </w:r>
+      <w:r>
+        <w:rPr>
+          <w:rFonts w:ascii="Courier New" w:hAnsi="Courier New"/>
+        </w:rPr>
+        <w:t>generate_summary.py</w:t>
+      </w:r>
+      <w:r>
+        <w:t xml:space="preserve">, </w:t>
+      </w:r>
+      <w:r>
+        <w:rPr>
+          <w:rFonts w:ascii="Courier New" w:hAnsi="Courier New"/>
+        </w:rPr>
+        <w:t>generate_ione_rsm_v3.py</w:t>
+      </w:r>
+      <w:r>
+        <w:t xml:space="preserve"> and </w:t>
+      </w:r>
+      <w:r>
+        <w:rPr>
+          <w:rFonts w:ascii="Courier New" w:hAnsi="Courier New"/>
+        </w:rPr>
+        <w:t>generate_rsm_tables.py</w:t>
+      </w:r>
+      <w:r>
+        <w:t xml:space="preserve"> scripts that regenerate all manuscript numbers, figures and tables in a Python 3.10.12 environment. The exact Git commit hash used to create this submission package is recorded in </w:t>
+      </w:r>
+      <w:r>
+        <w:rPr>
+          <w:rFonts w:ascii="Courier New" w:hAnsi="Courier New"/>
+        </w:rPr>
+        <w:t>results/commit_hash.txt</w:t>
+      </w:r>
+      <w:r>
+        <w:t xml:space="preserve">. An archived Zenodo release with a DOI will be created before acceptance to satisfy long-term reproducibility requirements. The published aggregate datasets used for the semi-synthetic illustrations are referenced in the original publications </w:t>
+      </w:r>
+      <w:r>
+        <w:rPr>
+          <w:vertAlign w:val="superscript"/>
+        </w:rPr>
+        <w:t>11</w:t>
+      </w:r>
+      <w:r/>
+      <w:r>
+        <w:rPr>
+          <w:vertAlign w:val="superscript"/>
+        </w:rPr>
+        <w:t>12</w:t>
+      </w:r>
+      <w:r/>
+      <w:r>
+        <w:rPr>
+          <w:vertAlign w:val="superscript"/>
+        </w:rPr>
+        <w:t>13</w:t>
+      </w:r>
+      <w:r/>
+      <w:r>
+        <w:rPr>
+          <w:vertAlign w:val="superscript"/>
+        </w:rPr>
+        <w:t>14</w:t>
+      </w:r>
+      <w:r/>
+      <w:r>
+        <w:rPr>
+          <w:vertAlign w:val="superscript"/>
+        </w:rPr>
+        <w:t>15</w:t>
+      </w:r>
+      <w:r>
+        <w:t>.</w:t>
+      </w:r>
+    </w:p>
+    <w:p>
+      <w:pPr>
+        <w:pStyle w:val="Heading2"/>
+      </w:pPr>
+      <w:r>
+        <w:t>Competing interests</w:t>
+      </w:r>
+    </w:p>
+    <w:p>
+      <w:r>
+        <w:t>The authors declare that they have no competing interests.</w:t>
+      </w:r>
+    </w:p>
+    <w:p>
+      <w:pPr>
+        <w:pStyle w:val="Heading2"/>
+      </w:pPr>
+      <w:r>
+        <w:t>Funding</w:t>
+      </w:r>
+    </w:p>
+    <w:p>
+      <w:r>
+        <w:t>No external funding supported this work.</w:t>
+      </w:r>
+    </w:p>
+    <w:p>
+      <w:pPr>
+        <w:pStyle w:val="Heading2"/>
+      </w:pPr>
+      <w:r>
+        <w:t>Authors' contributions (CRediT taxonomy)</w:t>
+      </w:r>
+    </w:p>
+    <w:p>
+      <w:r>
+        <w:t>Onishi Tatsuki: Conceptualisation, methodology, software, formal analysis, writing – original draft, writing – review and editing, visualisation.</w:t>
+      </w:r>
+    </w:p>
+    <w:p>
+      <w:pPr>
+        <w:pStyle w:val="Heading2"/>
+      </w:pPr>
+      <w:r>
+        <w:t>Acknowledgements</w:t>
+      </w:r>
+    </w:p>
+    <w:p>
+      <w:r>
+        <w:t>Not applicable.</w:t>
+      </w:r>
+    </w:p>
+    <w:p>
+      <w:pPr>
+        <w:pStyle w:val="Heading2"/>
+      </w:pPr>
+      <w:r>
+        <w:t>Supplementary materials</w:t>
+      </w:r>
+    </w:p>
+    <w:p>
+      <w:r>
+        <w:t xml:space="preserve">Supplementary methods, abbreviations, the ADEMP/STROBE-Sim checklists, the four extended sensitivity tables, and the empirical null-distribution and </w:t>
       </w:r>
       <m:oMath>
         <m:sSub>
@@ -6245,7 +6460,16 @@
         </m:sSub>
       </m:oMath>
       <w:r>
-        <w:t xml:space="preserve"> is robust to the outcome-model specification. The simulation code, analysis scripts and generated tables are publicly available so readers can reproduce every numerical result.</w:t>
+        <w:t xml:space="preserve"> misspecification sensitivity tables are provided in </w:t>
+      </w:r>
+      <w:r>
+        <w:rPr>
+          <w:rFonts w:ascii="Courier New" w:hAnsi="Courier New"/>
+        </w:rPr>
+        <w:t>jcmds_supplementary_v1.docx</w:t>
+      </w:r>
+      <w:r>
+        <w:t>.</w:t>
       </w:r>
     </w:p>
     <w:p>
@@ -6253,354 +6477,12 @@
         <w:pStyle w:val="Heading2"/>
       </w:pPr>
       <w:r>
-        <w:t>Strengths and limitations</w:t>
+        <w:t>Declaration of generative AI and AI-assisted technologies in the manuscript preparation process</w:t>
       </w:r>
     </w:p>
     <w:p>
-      <w:r/>
-      <w:r>
-        <w:rPr>
-          <w:b/>
-        </w:rPr>
-        <w:t>Strengths.</w:t>
-      </w:r>
-      <w:r>
-        <w:t xml:space="preserve"> The study followed ADEMP </w:t>
-      </w:r>
-      <w:r>
-        <w:rPr>
-          <w:vertAlign w:val="superscript"/>
-        </w:rPr>
-        <w:t>16</w:t>
-      </w:r>
-      <w:r>
-        <w:t>, reported the data-generating mechanism and estimands transparently, and generated all numerical results from version-controlled repository scripts.</w:t>
-      </w:r>
-    </w:p>
-    <w:p>
-      <w:pPr>
-        <w:spacing w:before="240"/>
-      </w:pPr>
-      <w:r/>
-      <w:r>
-        <w:rPr>
-          <w:b/>
-        </w:rPr>
-        <w:t>Limitations.</w:t>
-      </w:r>
-      <w:r>
-        <w:t xml:space="preserve"> The primary scenario used n=2000 and a moderate Z-to-X trace; sensitivity analyses examined K = 3, 5, 10, n = 500 to 10 000, Z-to-Y and Z-to-X scales, and a non-linear mapping, but performance may vary with stronger or weaker signals or fewer studies. The true-Z partition is a constructed reference, so ARI should not be over-interpreted as clinical validity. </w:t>
-      </w:r>
-      <m:oMath>
-        <m:sSub>
-          <m:e>
-            <m:r>
-              <m:t xml:space="preserve">W</m:t>
-            </m:r>
-          </m:e>
-          <m:sub>
-            <m:r>
-              <m:t xml:space="preserve">est</m:t>
-            </m:r>
-          </m:sub>
-        </m:sSub>
-      </m:oMath>
-      <w:r>
-        <w:t xml:space="preserve"> depends on a correctly specified outcome model with interactions; a main-effects-only model can be highly misleading (Supplementary Table S6). DerSimonian-Laird strata are not independent estimates, so the reported </w:t>
-      </w:r>
-      <m:oMath>
-        <m:sSup>
-          <m:e>
-            <m:r>
-              <m:t xml:space="preserve">τ</m:t>
-            </m:r>
-          </m:e>
-          <m:sup>
-            <m:r>
-              <m:t xml:space="preserve">2</m:t>
-            </m:r>
-          </m:sup>
-        </m:sSup>
-      </m:oMath>
-      <w:r>
-        <w:t xml:space="preserve"> and </w:t>
-      </w:r>
-      <m:oMath>
-        <m:sSup>
-          <m:e>
-            <m:r>
-              <m:t xml:space="preserve">I</m:t>
-            </m:r>
-          </m:e>
-          <m:sup>
-            <m:r>
-              <m:t xml:space="preserve">2</m:t>
-            </m:r>
-          </m:sup>
-        </m:sSup>
-      </m:oMath>
-      <w:r>
-        <w:t xml:space="preserve"> describe between-stratum heterogeneity, not conventional between-study heterogeneity. C1 is computed from log odds ratios while ATE bias is on the risk-difference scale, so it is an indirect diagnostic. Null thresholds (Supplementary Table S5) are method-specific and conditional on the primary DGM. Semi-synthetic examples are pseudo-IPD reconstructions and serve as illustrations, not real-IPD validation.</w:t>
-      </w:r>
-    </w:p>
-    <w:p>
-      <w:pPr>
-        <w:pStyle w:val="Heading1"/>
-      </w:pPr>
-      <w:r>
-        <w:t>5. Conclusions</w:t>
-      </w:r>
-    </w:p>
-    <w:p>
-      <w:r>
-        <w:t>IONE (Incoherence-Oriented Neutralisation and Extraction) is a descriptive sensitivity framework for hidden effect modification in IPD meta-analysis. Monte Carlo simulation and semi-synthetic examples show that the C1 and W diagnostics can flag incoherence, but they do not reliably separate the alternative data-generating mechanism from an empirical null in the primary scenario. When hidden variables leave strong traces in measured covariates, stratification can partially reduce ATE bias, but separating the data into the true hidden subgroups remains difficult. Conventional meta-analytic models and covariate adjustment should remain the primary analysis; C1 and W should be reported alongside them as sensitivity checks. Two practical recommendations are: (1) use C1 and W only as descriptive flags, not as inferential tests for hidden effect modification, and (2) pre-specify potential effect modifiers and reserve data-driven stratification for exploratory sensitivity analyses, not for decision-making.</w:t>
-      </w:r>
-    </w:p>
-    <w:p>
-      <w:r>
-        <w:br w:type="page"/>
-      </w:r>
-    </w:p>
-    <w:p>
-      <w:pPr>
-        <w:pStyle w:val="Heading1"/>
-      </w:pPr>
-      <w:r>
-        <w:t>Declarations</w:t>
-      </w:r>
-    </w:p>
-    <w:p>
-      <w:pPr>
-        <w:pStyle w:val="Heading2"/>
-      </w:pPr>
-      <w:r>
-        <w:t>Ethics approval and consent to participate</w:t>
-      </w:r>
-    </w:p>
-    <w:p>
-      <w:r>
-        <w:t>Not applicable. This study used simulated data and publicly available aggregate statistics only.</w:t>
-      </w:r>
-    </w:p>
-    <w:p>
-      <w:pPr>
-        <w:pStyle w:val="Heading2"/>
-      </w:pPr>
-      <w:r>
-        <w:t>Consent for publication</w:t>
-      </w:r>
-    </w:p>
-    <w:p>
-      <w:r>
-        <w:t>Not applicable.</w:t>
-      </w:r>
-    </w:p>
-    <w:p>
-      <w:pPr>
-        <w:pStyle w:val="Heading2"/>
-      </w:pPr>
-      <w:r>
-        <w:t>Availability of data and materials</w:t>
-      </w:r>
-    </w:p>
-    <w:p>
-      <w:r>
-        <w:t xml:space="preserve">All simulation code, analysis scripts, semi-synthetic example data, and the manuscript generator are publicly available at https://github.com/bougtoir/ione-stratification-framework. The repository contains a </w:t>
-      </w:r>
-      <w:r>
-        <w:rPr>
-          <w:rFonts w:ascii="Courier New" w:hAnsi="Courier New"/>
-        </w:rPr>
-        <w:t>requirements.txt</w:t>
-      </w:r>
-      <w:r>
-        <w:t xml:space="preserve"> file and a </w:t>
-      </w:r>
-      <w:r>
-        <w:rPr>
-          <w:rFonts w:ascii="Courier New" w:hAnsi="Courier New"/>
-        </w:rPr>
-        <w:t>requirements-lock.txt</w:t>
-      </w:r>
-      <w:r>
-        <w:t xml:space="preserve"> file with exact package versions, fixed random seeds for every scenario, and </w:t>
-      </w:r>
-      <w:r>
-        <w:rPr>
-          <w:rFonts w:ascii="Courier New" w:hAnsi="Courier New"/>
-        </w:rPr>
-        <w:t>generate_summary.py</w:t>
-      </w:r>
-      <w:r>
-        <w:t xml:space="preserve">, </w:t>
-      </w:r>
-      <w:r>
-        <w:rPr>
-          <w:rFonts w:ascii="Courier New" w:hAnsi="Courier New"/>
-        </w:rPr>
-        <w:t>generate_ione_rsm_v3.py</w:t>
-      </w:r>
-      <w:r>
-        <w:t xml:space="preserve"> and </w:t>
-      </w:r>
-      <w:r>
-        <w:rPr>
-          <w:rFonts w:ascii="Courier New" w:hAnsi="Courier New"/>
-        </w:rPr>
-        <w:t>generate_rsm_tables.py</w:t>
-      </w:r>
-      <w:r>
-        <w:t xml:space="preserve"> scripts that regenerate all manuscript numbers, figures and tables in a Python 3.10.12 environment. The exact Git commit hash used to create this submission package is recorded in </w:t>
-      </w:r>
-      <w:r>
-        <w:rPr>
-          <w:rFonts w:ascii="Courier New" w:hAnsi="Courier New"/>
-        </w:rPr>
-        <w:t>results/commit_hash.txt</w:t>
-      </w:r>
-      <w:r>
-        <w:t xml:space="preserve">. An archived Zenodo release with a DOI will be created before acceptance to satisfy long-term reproducibility requirements. The published aggregate datasets used for the semi-synthetic illustrations are referenced in the original publications </w:t>
-      </w:r>
-      <w:r>
-        <w:rPr>
-          <w:vertAlign w:val="superscript"/>
-        </w:rPr>
-        <w:t>11</w:t>
-      </w:r>
-      <w:r/>
-      <w:r>
-        <w:rPr>
-          <w:vertAlign w:val="superscript"/>
-        </w:rPr>
-        <w:t>12</w:t>
-      </w:r>
-      <w:r/>
-      <w:r>
-        <w:rPr>
-          <w:vertAlign w:val="superscript"/>
-        </w:rPr>
-        <w:t>13</w:t>
-      </w:r>
-      <w:r/>
-      <w:r>
-        <w:rPr>
-          <w:vertAlign w:val="superscript"/>
-        </w:rPr>
-        <w:t>14</w:t>
-      </w:r>
-      <w:r/>
-      <w:r>
-        <w:rPr>
-          <w:vertAlign w:val="superscript"/>
-        </w:rPr>
-        <w:t>15</w:t>
-      </w:r>
-      <w:r>
-        <w:t>.</w:t>
-      </w:r>
-    </w:p>
-    <w:p>
-      <w:pPr>
-        <w:pStyle w:val="Heading2"/>
-      </w:pPr>
-      <w:r>
-        <w:t>Competing interests</w:t>
-      </w:r>
-    </w:p>
-    <w:p>
-      <w:r>
-        <w:t>The authors declare that they have no competing interests.</w:t>
-      </w:r>
-    </w:p>
-    <w:p>
-      <w:pPr>
-        <w:pStyle w:val="Heading2"/>
-      </w:pPr>
-      <w:r>
-        <w:t>Funding</w:t>
-      </w:r>
-    </w:p>
-    <w:p>
-      <w:r>
-        <w:t>No external funding supported this work.</w:t>
-      </w:r>
-    </w:p>
-    <w:p>
-      <w:pPr>
-        <w:pStyle w:val="Heading2"/>
-      </w:pPr>
-      <w:r>
-        <w:t>Authors' contributions (CRediT taxonomy)</w:t>
-      </w:r>
-    </w:p>
-    <w:p>
-      <w:r>
-        <w:t>Onishi Tatsuki: Conceptualisation, methodology, software, formal analysis, writing – original draft, writing – review and editing, visualisation.</w:t>
-      </w:r>
-    </w:p>
-    <w:p>
-      <w:pPr>
-        <w:pStyle w:val="Heading2"/>
-      </w:pPr>
-      <w:r>
-        <w:t>Acknowledgements</w:t>
-      </w:r>
-    </w:p>
-    <w:p>
-      <w:r>
-        <w:t>Not applicable.</w:t>
-      </w:r>
-    </w:p>
-    <w:p>
-      <w:pPr>
-        <w:pStyle w:val="Heading2"/>
-      </w:pPr>
-      <w:r>
-        <w:t>Supplementary materials</w:t>
-      </w:r>
-    </w:p>
-    <w:p>
-      <w:r>
-        <w:t xml:space="preserve">Supplementary methods, abbreviations, the ADEMP/STROBE-Sim checklists, the four extended sensitivity tables, and the empirical null-distribution and </w:t>
-      </w:r>
-      <m:oMath>
-        <m:sSub>
-          <m:e>
-            <m:r>
-              <m:t xml:space="preserve">W</m:t>
-            </m:r>
-          </m:e>
-          <m:sub>
-            <m:r>
-              <m:t xml:space="preserve">est</m:t>
-            </m:r>
-          </m:sub>
-        </m:sSub>
-      </m:oMath>
-      <w:r>
-        <w:t xml:space="preserve"> misspecification sensitivity tables are provided in </w:t>
-      </w:r>
-      <w:r>
-        <w:rPr>
-          <w:rFonts w:ascii="Courier New" w:hAnsi="Courier New"/>
-        </w:rPr>
-        <w:t>jcmds_supplementary_v1.docx</w:t>
-      </w:r>
-      <w:r>
-        <w:t>.</w:t>
-      </w:r>
-    </w:p>
-    <w:p>
-      <w:pPr>
-        <w:pStyle w:val="Heading2"/>
-      </w:pPr>
-      <w:r>
-        <w:t>Declaration of generative AI and AI-assisted technologies in the manuscript preparation process</w:t>
-      </w:r>
-    </w:p>
-    <w:p>
-      <w:r>
-        <w:t>During the preparation of this work the author(s) used OpenAI GPT-4 and GPT-4o (accessed August 2025 through August 2026) to draft and revise prose, format references, generate figures, and implement the computational pipeline. After using these tools, the author reviewed and edited the content as needed and takes full responsibility for the content of the published article. The author designed the study, wrote the simulation code, selected all references, verified every numerical result against the repository outputs, and approved the final scientific content. No AI-generated text was used without human review.</w:t>
+      <w:r>
+        <w:t>During the preparation of this work the author(s) used OpenAI GPT-4 and GPT-4o (accessed August 2025 through the date of submission) to draft and revise prose, format references, generate figures, and implement the computational pipeline. After using these tools, the author reviewed and edited the content as needed and takes full responsibility for the content of the published article. The author designed the study, wrote the simulation code, selected all references, verified every numerical result against the repository outputs, and approved the final scientific content. No AI-generated text was used without human review.</w:t>
       </w:r>
     </w:p>
     <w:p>

</xml_diff>